<commit_message>
Final edits to cellular-I before class; rerender entire site.
</commit_message>
<xml_diff>
--- a/docs/exercises/ex-EMO.docx
+++ b/docs/exercises/ex-EMO.docx
@@ -44,6 +44,18 @@
       </w:pPr>
       <w:r>
         <w:t xml:space="preserve">To more deeply understand how emotions are measured.</w:t>
+      </w:r>
+    </w:p>
+    <w:p>
+      <w:pPr>
+        <w:pStyle w:val="Compact"/>
+        <w:numPr>
+          <w:ilvl w:val="0"/>
+          <w:numId w:val="1001"/>
+        </w:numPr>
+      </w:pPr>
+      <w:r>
+        <w:t xml:space="preserve">To consider the challenges of capturing important dimensions of emotional states given the limitations of existing measurement tools.</w:t>
       </w:r>
     </w:p>
     <w:bookmarkEnd w:id="20"/>

</xml_diff>